<commit_message>
Docs(인허가): SAD 부트로더 절 보완 + SDDD CM3 장
SAD 3.4 절을 실제 구조로 다시 썼다
- 1단계에서 지적한 복호화/매니페스트 외에 두 가지가 더 있었다.
  A/B 슬롯 복구(ci_boot.c 의 slot 결정과 대체 슬롯 검증)와 서비스 모드
  분기(main.c 가 지정 핀 레벨로 정상 기동과 서비스 모드를 가름)
- 3개 모듈 10개 항목으로 재작성: 부트 제어(시스템 초기화/동작 모드 판정/
  코어 기동), 이미지 적재(부트 대상 결정/무결성 검증/복호화/적재 및 보호),
  무선 갱신(수신/적용 대상 선택/복구)
- 추적성에 RID 77~79 추가(암호화 보관과 복호화, 코드 영역 쓰기 금지,
  갱신 실패 시 복구). 모두 부트로더 모듈이라 착탈 블록 75~79 가 표 끝에서
  연속을 유지한다. 76 -> 79행

SDDD 5장 CM3 - 유닛 185건, 순서도 6점
- 시스템 제어(SI 4 + 6항목) / 신호처리 / 내부 자극 장치 실행(SI 1 + 5항목)
  / 블루투스 통신(SI 1 + 3항목)
- 계획 규칙_2 대로 단순 설정/조회 짝 45건을 각각 한 유닛으로 묶었다.
  공유 메모리 접근은 1.5세대 43 유닛 대비 27 유닛으로 오히려 성기다.
  총 유닛이 1.5세대의 1.6배인 것은 입도가 아니라 대상이 커진 결과다

검증에서 잡힌 것
- 짝 유닛 정합 검증(검증_8)을 새로 넣었더니 잘못된 짝 하나를 잡았다.
  보조 전력 소자의 "리셋"과 "레지스터 읽기"는 짝이 아니다. 두 유닛으로 분리
- SPI 통신 상태 유닛은 조회를 주 함수로 두어 방향이 뒤집혀 있었다. 바로잡음

자체 검증 8항 통과. CFX 115 + CM3 185 = 300 유닛, 서명 대조 303건 불일치 0.
</commit_message>
<xml_diff>
--- a/docs/참고/인허가/사운드1/[01] SAD-FW-SND1 소프트웨어 아키텍쳐 기술서.docx
+++ b/docs/참고/인허가/사운드1/[01] SAD-FW-SND1 소프트웨어 아키텍쳐 기술서.docx
@@ -4709,7 +4709,7 @@
           <w:sz w:val="20"/>
           <w:rFonts w:eastAsia="맑은 고딕" w:ascii="맑은 고딕" w:hAnsi="맑은 고딕"/>
         </w:rPr>
-        <w:t>부트로더는 응용 소프트웨어보다 먼저 실행되어 실행 이미지의 무결성을 확인하고 각 코어를 기동한다. 또한 무선으로 전달된 갱신 이미지를 저장하고 적용한다.</w:t>
+        <w:t>부트로더는 응용 소프트웨어보다 먼저 실행되어 하드웨어를 초기 상태로 만들고, 비휘발성 저장장치에 보관된 실행 이미지를 검증 및 복호화하여 메모리에 적재한 뒤 각 코어를 기동한다. 또한 무선으로 전달된 갱신 이미지를 보관하고, 다음 기동에서 적용하거나 실패 시 이전 이미지로 되돌린다.</w:t>
       </w:r>
     </w:p>
     <w:p>
@@ -4731,23 +4731,6 @@
     </w:p>
     <w:p>
       <w:pPr>
-        <w:keepNext/>
-        <w:spacing w:before="160" w:after="100"/>
-        <w:ind w:left="454"/>
-        <w:jc w:val="left"/>
-      </w:pPr>
-      <w:r>
-        <w:rPr>
-          <w:b/>
-          <w:i w:val="0"/>
-          <w:sz w:val="21"/>
-          <w:rFonts w:eastAsia="맑은 고딕" w:ascii="맑은 고딕" w:hAnsi="맑은 고딕"/>
-        </w:rPr>
-        <w:t>3.4.1.1.  무결성 검증 항목</w:t>
-      </w:r>
-    </w:p>
-    <w:p>
-      <w:pPr>
         <w:spacing w:before="60" w:after="60" w:line="324" w:lineRule="auto"/>
         <w:jc w:val="both"/>
       </w:pPr>
@@ -4758,7 +4741,7 @@
           <w:sz w:val="20"/>
           <w:rFonts w:eastAsia="맑은 고딕" w:ascii="맑은 고딕" w:hAnsi="맑은 고딕"/>
         </w:rPr>
-        <w:t>각 코어의 실행 이미지에 대해 CRC 를 산출하여 저장된 값과 비교하고, 불일치 시 기동을 중단한다.</w:t>
+        <w:t>기동 직후의 하드웨어 설정과 동작 모드 판정, 코어 기동을 담당한다.</w:t>
       </w:r>
     </w:p>
     <w:p>
@@ -4775,7 +4758,7 @@
           <w:sz w:val="21"/>
           <w:rFonts w:eastAsia="맑은 고딕" w:ascii="맑은 고딕" w:hAnsi="맑은 고딕"/>
         </w:rPr>
-        <w:t>3.4.1.2.  코어 기동 항목</w:t>
+        <w:t>3.4.1.1.  시스템 초기화 항목</w:t>
       </w:r>
     </w:p>
     <w:p>
@@ -4790,7 +4773,71 @@
           <w:sz w:val="20"/>
           <w:rFonts w:eastAsia="맑은 고딕" w:ascii="맑은 고딕" w:hAnsi="맑은 고딕"/>
         </w:rPr>
-        <w:t>검증을 통과한 실행 이미지로 CFX Core, HEAR Core, Cortex-M3 를 순서대로 기동한다.</w:t>
+        <w:t>인터럽트를 모두 차단하고 필수 입출력을 설정한다. 블루투스 콤보 칩셋을 절전 상태로 두고 내부기 연결 상태를 미연결로 표시하여, 기동 과정에서 자극이나 무선 동작이 일어나지 않게 한다. 코어 간 공유 메모리의 적재 완료 표시를 지운다.</w:t>
+      </w:r>
+    </w:p>
+    <w:p>
+      <w:pPr>
+        <w:keepNext/>
+        <w:spacing w:before="160" w:after="100"/>
+        <w:ind w:left="454"/>
+        <w:jc w:val="left"/>
+      </w:pPr>
+      <w:r>
+        <w:rPr>
+          <w:b/>
+          <w:i w:val="0"/>
+          <w:sz w:val="21"/>
+          <w:rFonts w:eastAsia="맑은 고딕" w:ascii="맑은 고딕" w:hAnsi="맑은 고딕"/>
+        </w:rPr>
+        <w:t>3.4.1.2.  동작 모드 판정 항목</w:t>
+      </w:r>
+    </w:p>
+    <w:p>
+      <w:pPr>
+        <w:spacing w:before="60" w:after="60" w:line="324" w:lineRule="auto"/>
+        <w:jc w:val="both"/>
+      </w:pPr>
+      <w:r>
+        <w:rPr>
+          <w:b w:val="0"/>
+          <w:i w:val="0"/>
+          <w:sz w:val="20"/>
+          <w:rFonts w:eastAsia="맑은 고딕" w:ascii="맑은 고딕" w:hAnsi="맑은 고딕"/>
+        </w:rPr>
+        <w:t>지정된 입력 핀의 레벨을 확인하여 정상 기동과 서비스 모드 중 하나를 선택한다. 서비스 모드는 생산 및 정비 과정에서 저장된 이미지를 확인하기 위한 경로이며 자극 출력을 수행하지 않는다.</w:t>
+      </w:r>
+    </w:p>
+    <w:p>
+      <w:pPr>
+        <w:keepNext/>
+        <w:spacing w:before="160" w:after="100"/>
+        <w:ind w:left="454"/>
+        <w:jc w:val="left"/>
+      </w:pPr>
+      <w:r>
+        <w:rPr>
+          <w:b/>
+          <w:i w:val="0"/>
+          <w:sz w:val="21"/>
+          <w:rFonts w:eastAsia="맑은 고딕" w:ascii="맑은 고딕" w:hAnsi="맑은 고딕"/>
+        </w:rPr>
+        <w:t>3.4.1.3.  코어 기동 항목</w:t>
+      </w:r>
+    </w:p>
+    <w:p>
+      <w:pPr>
+        <w:spacing w:before="60" w:after="60" w:line="324" w:lineRule="auto"/>
+        <w:jc w:val="both"/>
+      </w:pPr>
+      <w:r>
+        <w:rPr>
+          <w:b w:val="0"/>
+          <w:i w:val="0"/>
+          <w:sz w:val="20"/>
+          <w:rFonts w:eastAsia="맑은 고딕" w:ascii="맑은 고딕" w:hAnsi="맑은 고딕"/>
+        </w:rPr>
+        <w:t>적재와 검증을 통과한 이미지로 Cortex-M3 와 CFX Core 를 기동한다. 기동에 필요한 시작 주소와 스택 위치는 이미지 헤더가 제공한다. 검증에 실패하면 기동하지 않고 오류 상태로 남는다.</w:t>
       </w:r>
     </w:p>
     <w:p>
@@ -4807,7 +4854,22 @@
           <w:sz w:val="22"/>
           <w:rFonts w:eastAsia="맑은 고딕" w:ascii="맑은 고딕" w:hAnsi="맑은 고딕"/>
         </w:rPr>
-        <w:t>3.4.2.  무선 갱신 모듈</w:t>
+        <w:t>3.4.2.  이미지 적재 모듈</w:t>
+      </w:r>
+    </w:p>
+    <w:p>
+      <w:pPr>
+        <w:spacing w:before="60" w:after="60" w:line="324" w:lineRule="auto"/>
+        <w:jc w:val="both"/>
+      </w:pPr>
+      <w:r>
+        <w:rPr>
+          <w:b w:val="0"/>
+          <w:i w:val="0"/>
+          <w:sz w:val="20"/>
+          <w:rFonts w:eastAsia="맑은 고딕" w:ascii="맑은 고딕" w:hAnsi="맑은 고딕"/>
+        </w:rPr>
+        <w:t>저장장치의 실행 이미지를 읽어 검증, 복호화, 적재하는 유닛들로 구성된다.</w:t>
       </w:r>
     </w:p>
     <w:p>
@@ -4824,7 +4886,7 @@
           <w:sz w:val="21"/>
           <w:rFonts w:eastAsia="맑은 고딕" w:ascii="맑은 고딕" w:hAnsi="맑은 고딕"/>
         </w:rPr>
-        <w:t>3.4.2.1.  갱신 이미지 수신 항목</w:t>
+        <w:t>3.4.2.1.  부트 대상 결정 항목</w:t>
       </w:r>
     </w:p>
     <w:p>
@@ -4839,7 +4901,7 @@
           <w:sz w:val="20"/>
           <w:rFonts w:eastAsia="맑은 고딕" w:ascii="맑은 고딕" w:hAnsi="맑은 고딕"/>
         </w:rPr>
-        <w:t>블루투스 콤보 칩셋을 경유하여 전달되는 갱신 이미지를 수신하고 저장한다.</w:t>
+        <w:t>시스템 변수에 기록된 기동 대상 번호를 읽어 적재할 이미지 목록 파일을 결정한다. 번호가 지정되지 않은 경우 저장장치의 기본 목록을 사용한다.</w:t>
       </w:r>
     </w:p>
     <w:p>
@@ -4856,7 +4918,7 @@
           <w:sz w:val="21"/>
           <w:rFonts w:eastAsia="맑은 고딕" w:ascii="맑은 고딕" w:hAnsi="맑은 고딕"/>
         </w:rPr>
-        <w:t>3.4.2.2.  갱신 적용 항목</w:t>
+        <w:t>3.4.2.2.  무결성 검증 항목</w:t>
       </w:r>
     </w:p>
     <w:p>
@@ -4871,7 +4933,199 @@
           <w:sz w:val="20"/>
           <w:rFonts w:eastAsia="맑은 고딕" w:ascii="맑은 고딕" w:hAnsi="맑은 고딕"/>
         </w:rPr>
-        <w:t>수신이 완료된 이미지의 무결성을 확인한 뒤 다음 기동부터 적용되도록 전환한다. 검증에 실패하면 기존 이미지를 유지한다.</w:t>
+        <w:t>이미지 헤더와 각 데이터 구획에 대해 순환 중복 검사 값을 산출하여 기록된 값과 비교한다. 불일치가 있으면 적재를 중단하고 오류를 기록한다.</w:t>
+      </w:r>
+    </w:p>
+    <w:p>
+      <w:pPr>
+        <w:keepNext/>
+        <w:spacing w:before="160" w:after="100"/>
+        <w:ind w:left="454"/>
+        <w:jc w:val="left"/>
+      </w:pPr>
+      <w:r>
+        <w:rPr>
+          <w:b/>
+          <w:i w:val="0"/>
+          <w:sz w:val="21"/>
+          <w:rFonts w:eastAsia="맑은 고딕" w:ascii="맑은 고딕" w:hAnsi="맑은 고딕"/>
+        </w:rPr>
+        <w:t>3.4.2.3.  복호화 항목</w:t>
+      </w:r>
+    </w:p>
+    <w:p>
+      <w:pPr>
+        <w:spacing w:before="60" w:after="60" w:line="324" w:lineRule="auto"/>
+        <w:jc w:val="both"/>
+      </w:pPr>
+      <w:r>
+        <w:rPr>
+          <w:b w:val="0"/>
+          <w:i w:val="0"/>
+          <w:sz w:val="20"/>
+          <w:rFonts w:eastAsia="맑은 고딕" w:ascii="맑은 고딕" w:hAnsi="맑은 고딕"/>
+        </w:rPr>
+        <w:t>저장장치에는 실행 이미지가 암호화된 상태로 보관된다. 장치에 내장된 키로 복호화한 뒤 적재한다. 이로써 저장 매체를 물리적으로 분리하더라도 실행 코드를 그대로 얻을 수 없다.</w:t>
+      </w:r>
+    </w:p>
+    <w:p>
+      <w:pPr>
+        <w:keepNext/>
+        <w:spacing w:before="160" w:after="100"/>
+        <w:ind w:left="454"/>
+        <w:jc w:val="left"/>
+      </w:pPr>
+      <w:r>
+        <w:rPr>
+          <w:b/>
+          <w:i w:val="0"/>
+          <w:sz w:val="21"/>
+          <w:rFonts w:eastAsia="맑은 고딕" w:ascii="맑은 고딕" w:hAnsi="맑은 고딕"/>
+        </w:rPr>
+        <w:t>3.4.2.4.  메모리 적재 및 보호 항목</w:t>
+      </w:r>
+    </w:p>
+    <w:p>
+      <w:pPr>
+        <w:spacing w:before="60" w:after="60" w:line="324" w:lineRule="auto"/>
+        <w:jc w:val="both"/>
+      </w:pPr>
+      <w:r>
+        <w:rPr>
+          <w:b w:val="0"/>
+          <w:i w:val="0"/>
+          <w:sz w:val="20"/>
+          <w:rFonts w:eastAsia="맑은 고딕" w:ascii="맑은 고딕" w:hAnsi="맑은 고딕"/>
+        </w:rPr>
+        <w:t>복호화된 구획을 각 코어의 프로그램 메모리 영역에 전송하고, 전송이 끝난 영역을 쓰기 금지 상태로 잠근다. 응용 소프트웨어가 실행 중에 자신의 코드 영역을 덮어쓰는 것을 막는다.</w:t>
+      </w:r>
+    </w:p>
+    <w:p>
+      <w:pPr>
+        <w:keepNext/>
+        <w:spacing w:before="200" w:after="100"/>
+        <w:ind w:left="227"/>
+        <w:jc w:val="left"/>
+      </w:pPr>
+      <w:r>
+        <w:rPr>
+          <w:b/>
+          <w:i w:val="0"/>
+          <w:sz w:val="22"/>
+          <w:rFonts w:eastAsia="맑은 고딕" w:ascii="맑은 고딕" w:hAnsi="맑은 고딕"/>
+        </w:rPr>
+        <w:t>3.4.3.  무선 갱신 모듈</w:t>
+      </w:r>
+    </w:p>
+    <w:p>
+      <w:pPr>
+        <w:spacing w:before="60" w:after="60" w:line="324" w:lineRule="auto"/>
+        <w:jc w:val="both"/>
+      </w:pPr>
+      <w:r>
+        <w:rPr>
+          <w:b w:val="0"/>
+          <w:i w:val="0"/>
+          <w:sz w:val="20"/>
+          <w:rFonts w:eastAsia="맑은 고딕" w:ascii="맑은 고딕" w:hAnsi="맑은 고딕"/>
+        </w:rPr>
+        <w:t>무선으로 전달된 갱신 이미지를 보관하고 적용하며, 실패 시 복구한다.</w:t>
+      </w:r>
+    </w:p>
+    <w:p>
+      <w:pPr>
+        <w:keepNext/>
+        <w:spacing w:before="160" w:after="100"/>
+        <w:ind w:left="454"/>
+        <w:jc w:val="left"/>
+      </w:pPr>
+      <w:r>
+        <w:rPr>
+          <w:b/>
+          <w:i w:val="0"/>
+          <w:sz w:val="21"/>
+          <w:rFonts w:eastAsia="맑은 고딕" w:ascii="맑은 고딕" w:hAnsi="맑은 고딕"/>
+        </w:rPr>
+        <w:t>3.4.3.1.  갱신 이미지 수신 항목</w:t>
+      </w:r>
+    </w:p>
+    <w:p>
+      <w:pPr>
+        <w:spacing w:before="60" w:after="60" w:line="324" w:lineRule="auto"/>
+        <w:jc w:val="both"/>
+      </w:pPr>
+      <w:r>
+        <w:rPr>
+          <w:b w:val="0"/>
+          <w:i w:val="0"/>
+          <w:sz w:val="20"/>
+          <w:rFonts w:eastAsia="맑은 고딕" w:ascii="맑은 고딕" w:hAnsi="맑은 고딕"/>
+        </w:rPr>
+        <w:t>블루투스 콤보 칩셋을 경유하여 전달되는 갱신 이미지를 저장장치에 기록한다. 수신은 응용 소프트웨어가 수행하고, 부트로더는 기록된 결과를 사용한다.</w:t>
+      </w:r>
+    </w:p>
+    <w:p>
+      <w:pPr>
+        <w:keepNext/>
+        <w:spacing w:before="160" w:after="100"/>
+        <w:ind w:left="454"/>
+        <w:jc w:val="left"/>
+      </w:pPr>
+      <w:r>
+        <w:rPr>
+          <w:b/>
+          <w:i w:val="0"/>
+          <w:sz w:val="21"/>
+          <w:rFonts w:eastAsia="맑은 고딕" w:ascii="맑은 고딕" w:hAnsi="맑은 고딕"/>
+        </w:rPr>
+        <w:t>3.4.3.2.  적용 대상 선택 항목</w:t>
+      </w:r>
+    </w:p>
+    <w:p>
+      <w:pPr>
+        <w:spacing w:before="60" w:after="60" w:line="324" w:lineRule="auto"/>
+        <w:jc w:val="both"/>
+      </w:pPr>
+      <w:r>
+        <w:rPr>
+          <w:b w:val="0"/>
+          <w:i w:val="0"/>
+          <w:sz w:val="20"/>
+          <w:rFonts w:eastAsia="맑은 고딕" w:ascii="맑은 고딕" w:hAnsi="맑은 고딕"/>
+        </w:rPr>
+        <w:t>실행 이미지는 두 개의 보관 위치에 번갈아 저장된다. 기동 시 보관 정보를 읽어 이번에 사용할 위치를 결정한다.</w:t>
+      </w:r>
+    </w:p>
+    <w:p>
+      <w:pPr>
+        <w:keepNext/>
+        <w:spacing w:before="160" w:after="100"/>
+        <w:ind w:left="454"/>
+        <w:jc w:val="left"/>
+      </w:pPr>
+      <w:r>
+        <w:rPr>
+          <w:b/>
+          <w:i w:val="0"/>
+          <w:sz w:val="21"/>
+          <w:rFonts w:eastAsia="맑은 고딕" w:ascii="맑은 고딕" w:hAnsi="맑은 고딕"/>
+        </w:rPr>
+        <w:t>3.4.3.3.  복구 항목</w:t>
+      </w:r>
+    </w:p>
+    <w:p>
+      <w:pPr>
+        <w:spacing w:before="60" w:after="60" w:line="324" w:lineRule="auto"/>
+        <w:jc w:val="both"/>
+      </w:pPr>
+      <w:r>
+        <w:rPr>
+          <w:b w:val="0"/>
+          <w:i w:val="0"/>
+          <w:sz w:val="20"/>
+          <w:rFonts w:eastAsia="맑은 고딕" w:ascii="맑은 고딕" w:hAnsi="맑은 고딕"/>
+        </w:rPr>
+        <w:t>선택된 이미지가 검증을 통과하지 못하면 직전에 정상 동작하던 위치의 이미지로 되돌려 기동한다. 갱신 실패로 제품이 기동하지 못하는 상태가 되지 않게 한다.</w:t>
       </w:r>
     </w:p>
     <w:p>
@@ -14862,7 +15116,7 @@
                 <w:sz w:val="16"/>
                 <w:rFonts w:eastAsia="맑은 고딕" w:ascii="맑은 고딕" w:hAnsi="맑은 고딕"/>
               </w:rPr>
-              <w:t>기동 시 실행 이미지 무결성 검증</w:t>
+              <w:t>기동 시 실행 이미지 무결성 검증 후 코어 기동</w:t>
             </w:r>
           </w:p>
         </w:tc>
@@ -15039,6 +15293,342 @@
                 <w:sz w:val="15"/>
                 <w:rFonts w:eastAsia="맑은 고딕" w:ascii="맑은 고딕" w:hAnsi="맑은 고딕"/>
               </w:rPr>
+            </w:r>
+          </w:p>
+        </w:tc>
+      </w:tr>
+      <w:tr>
+        <w:tc>
+          <w:tcPr>
+            <w:tcW w:type="dxa" w:w="1531"/>
+            <w:shd w:val="clear" w:color="auto" w:fill="E2EFDA"/>
+          </w:tcPr>
+          <w:p>
+            <w:pPr>
+              <w:spacing w:before="40" w:after="40"/>
+              <w:jc w:val="center"/>
+            </w:pPr>
+            <w:r/>
+            <w:r>
+              <w:rPr>
+                <w:b w:val="0"/>
+                <w:i w:val="0"/>
+                <w:sz w:val="16"/>
+                <w:rFonts w:eastAsia="맑은 고딕" w:ascii="맑은 고딕" w:hAnsi="맑은 고딕"/>
+              </w:rPr>
+              <w:t>SW-FW-RID-77</w:t>
+            </w:r>
+          </w:p>
+        </w:tc>
+        <w:tc>
+          <w:tcPr>
+            <w:tcW w:type="dxa" w:w="2891"/>
+            <w:shd w:val="clear" w:color="auto" w:fill="E2EFDA"/>
+          </w:tcPr>
+          <w:p>
+            <w:pPr>
+              <w:spacing w:before="40" w:after="40"/>
+              <w:jc w:val="left"/>
+            </w:pPr>
+            <w:r/>
+            <w:r>
+              <w:rPr>
+                <w:b w:val="0"/>
+                <w:i w:val="0"/>
+                <w:sz w:val="16"/>
+                <w:rFonts w:eastAsia="맑은 고딕" w:ascii="맑은 고딕" w:hAnsi="맑은 고딕"/>
+              </w:rPr>
+              <w:t>실행 이미지를 암호화하여 보관하고 기동 시 복호화</w:t>
+            </w:r>
+          </w:p>
+        </w:tc>
+        <w:tc>
+          <w:tcPr>
+            <w:tcW w:type="dxa" w:w="2438"/>
+            <w:shd w:val="clear" w:color="auto" w:fill="E2EFDA"/>
+          </w:tcPr>
+          <w:p>
+            <w:pPr>
+              <w:spacing w:before="40" w:after="40"/>
+              <w:jc w:val="left"/>
+            </w:pPr>
+            <w:r/>
+            <w:r>
+              <w:rPr>
+                <w:b w:val="0"/>
+                <w:i w:val="0"/>
+                <w:sz w:val="15"/>
+                <w:rFonts w:eastAsia="맑은 고딕" w:ascii="맑은 고딕" w:hAnsi="맑은 고딕"/>
+              </w:rPr>
+              <w:t>Bootloader Module</w:t>
+            </w:r>
+          </w:p>
+        </w:tc>
+        <w:tc>
+          <w:tcPr>
+            <w:tcW w:type="dxa" w:w="907"/>
+            <w:shd w:val="clear" w:color="auto" w:fill="E2EFDA"/>
+          </w:tcPr>
+          <w:p>
+            <w:pPr>
+              <w:spacing w:before="40" w:after="40"/>
+              <w:jc w:val="center"/>
+            </w:pPr>
+            <w:r/>
+            <w:r>
+              <w:rPr>
+                <w:b/>
+                <w:i w:val="0"/>
+                <w:sz w:val="16"/>
+                <w:rFonts w:eastAsia="맑은 고딕" w:ascii="맑은 고딕" w:hAnsi="맑은 고딕"/>
+              </w:rPr>
+              <w:t>신규</w:t>
+            </w:r>
+          </w:p>
+        </w:tc>
+        <w:tc>
+          <w:tcPr>
+            <w:tcW w:type="dxa" w:w="1871"/>
+            <w:shd w:val="clear" w:color="auto" w:fill="E2EFDA"/>
+          </w:tcPr>
+          <w:p>
+            <w:pPr>
+              <w:spacing w:before="40" w:after="40"/>
+              <w:jc w:val="left"/>
+            </w:pPr>
+            <w:r/>
+            <w:r>
+              <w:rPr>
+                <w:b w:val="0"/>
+                <w:i w:val="0"/>
+                <w:sz w:val="15"/>
+                <w:rFonts w:eastAsia="맑은 고딕" w:ascii="맑은 고딕" w:hAnsi="맑은 고딕"/>
+              </w:rPr>
+              <w:t>저장 매체 분리 시 코드 노출 방지</w:t>
+            </w:r>
+          </w:p>
+        </w:tc>
+      </w:tr>
+      <w:tr>
+        <w:tc>
+          <w:tcPr>
+            <w:tcW w:type="dxa" w:w="1531"/>
+            <w:shd w:val="clear" w:color="auto" w:fill="E2EFDA"/>
+          </w:tcPr>
+          <w:p>
+            <w:pPr>
+              <w:spacing w:before="40" w:after="40"/>
+              <w:jc w:val="center"/>
+            </w:pPr>
+            <w:r/>
+            <w:r>
+              <w:rPr>
+                <w:b w:val="0"/>
+                <w:i w:val="0"/>
+                <w:sz w:val="16"/>
+                <w:rFonts w:eastAsia="맑은 고딕" w:ascii="맑은 고딕" w:hAnsi="맑은 고딕"/>
+              </w:rPr>
+              <w:t>SW-FW-RID-78</w:t>
+            </w:r>
+          </w:p>
+        </w:tc>
+        <w:tc>
+          <w:tcPr>
+            <w:tcW w:type="dxa" w:w="2891"/>
+            <w:shd w:val="clear" w:color="auto" w:fill="E2EFDA"/>
+          </w:tcPr>
+          <w:p>
+            <w:pPr>
+              <w:spacing w:before="40" w:after="40"/>
+              <w:jc w:val="left"/>
+            </w:pPr>
+            <w:r/>
+            <w:r>
+              <w:rPr>
+                <w:b w:val="0"/>
+                <w:i w:val="0"/>
+                <w:sz w:val="16"/>
+                <w:rFonts w:eastAsia="맑은 고딕" w:ascii="맑은 고딕" w:hAnsi="맑은 고딕"/>
+              </w:rPr>
+              <w:t>적재한 코드 영역을 쓰기 금지로 보호</w:t>
+            </w:r>
+          </w:p>
+        </w:tc>
+        <w:tc>
+          <w:tcPr>
+            <w:tcW w:type="dxa" w:w="2438"/>
+            <w:shd w:val="clear" w:color="auto" w:fill="E2EFDA"/>
+          </w:tcPr>
+          <w:p>
+            <w:pPr>
+              <w:spacing w:before="40" w:after="40"/>
+              <w:jc w:val="left"/>
+            </w:pPr>
+            <w:r/>
+            <w:r>
+              <w:rPr>
+                <w:b w:val="0"/>
+                <w:i w:val="0"/>
+                <w:sz w:val="15"/>
+                <w:rFonts w:eastAsia="맑은 고딕" w:ascii="맑은 고딕" w:hAnsi="맑은 고딕"/>
+              </w:rPr>
+              <w:t>Bootloader Module</w:t>
+            </w:r>
+          </w:p>
+        </w:tc>
+        <w:tc>
+          <w:tcPr>
+            <w:tcW w:type="dxa" w:w="907"/>
+            <w:shd w:val="clear" w:color="auto" w:fill="E2EFDA"/>
+          </w:tcPr>
+          <w:p>
+            <w:pPr>
+              <w:spacing w:before="40" w:after="40"/>
+              <w:jc w:val="center"/>
+            </w:pPr>
+            <w:r/>
+            <w:r>
+              <w:rPr>
+                <w:b/>
+                <w:i w:val="0"/>
+                <w:sz w:val="16"/>
+                <w:rFonts w:eastAsia="맑은 고딕" w:ascii="맑은 고딕" w:hAnsi="맑은 고딕"/>
+              </w:rPr>
+              <w:t>신규</w:t>
+            </w:r>
+          </w:p>
+        </w:tc>
+        <w:tc>
+          <w:tcPr>
+            <w:tcW w:type="dxa" w:w="1871"/>
+            <w:shd w:val="clear" w:color="auto" w:fill="E2EFDA"/>
+          </w:tcPr>
+          <w:p>
+            <w:pPr>
+              <w:spacing w:before="40" w:after="40"/>
+              <w:jc w:val="left"/>
+            </w:pPr>
+            <w:r/>
+            <w:r>
+              <w:rPr>
+                <w:b w:val="0"/>
+                <w:i w:val="0"/>
+                <w:sz w:val="15"/>
+                <w:rFonts w:eastAsia="맑은 고딕" w:ascii="맑은 고딕" w:hAnsi="맑은 고딕"/>
+              </w:rPr>
+              <w:t>실행 중 코드 영역 훼손 방지</w:t>
+            </w:r>
+          </w:p>
+        </w:tc>
+      </w:tr>
+      <w:tr>
+        <w:tc>
+          <w:tcPr>
+            <w:tcW w:type="dxa" w:w="1531"/>
+            <w:shd w:val="clear" w:color="auto" w:fill="E2EFDA"/>
+          </w:tcPr>
+          <w:p>
+            <w:pPr>
+              <w:spacing w:before="40" w:after="40"/>
+              <w:jc w:val="center"/>
+            </w:pPr>
+            <w:r/>
+            <w:r>
+              <w:rPr>
+                <w:b w:val="0"/>
+                <w:i w:val="0"/>
+                <w:sz w:val="16"/>
+                <w:rFonts w:eastAsia="맑은 고딕" w:ascii="맑은 고딕" w:hAnsi="맑은 고딕"/>
+              </w:rPr>
+              <w:t>SW-FW-RID-79</w:t>
+            </w:r>
+          </w:p>
+        </w:tc>
+        <w:tc>
+          <w:tcPr>
+            <w:tcW w:type="dxa" w:w="2891"/>
+            <w:shd w:val="clear" w:color="auto" w:fill="E2EFDA"/>
+          </w:tcPr>
+          <w:p>
+            <w:pPr>
+              <w:spacing w:before="40" w:after="40"/>
+              <w:jc w:val="left"/>
+            </w:pPr>
+            <w:r/>
+            <w:r>
+              <w:rPr>
+                <w:b w:val="0"/>
+                <w:i w:val="0"/>
+                <w:sz w:val="16"/>
+                <w:rFonts w:eastAsia="맑은 고딕" w:ascii="맑은 고딕" w:hAnsi="맑은 고딕"/>
+              </w:rPr>
+              <w:t>갱신 실패 시 직전 정상 이미지로 복구</w:t>
+            </w:r>
+          </w:p>
+        </w:tc>
+        <w:tc>
+          <w:tcPr>
+            <w:tcW w:type="dxa" w:w="2438"/>
+            <w:shd w:val="clear" w:color="auto" w:fill="E2EFDA"/>
+          </w:tcPr>
+          <w:p>
+            <w:pPr>
+              <w:spacing w:before="40" w:after="40"/>
+              <w:jc w:val="left"/>
+            </w:pPr>
+            <w:r/>
+            <w:r>
+              <w:rPr>
+                <w:b w:val="0"/>
+                <w:i w:val="0"/>
+                <w:sz w:val="15"/>
+                <w:rFonts w:eastAsia="맑은 고딕" w:ascii="맑은 고딕" w:hAnsi="맑은 고딕"/>
+              </w:rPr>
+              <w:t>Bootloader Module</w:t>
+            </w:r>
+          </w:p>
+        </w:tc>
+        <w:tc>
+          <w:tcPr>
+            <w:tcW w:type="dxa" w:w="907"/>
+            <w:shd w:val="clear" w:color="auto" w:fill="E2EFDA"/>
+          </w:tcPr>
+          <w:p>
+            <w:pPr>
+              <w:spacing w:before="40" w:after="40"/>
+              <w:jc w:val="center"/>
+            </w:pPr>
+            <w:r/>
+            <w:r>
+              <w:rPr>
+                <w:b/>
+                <w:i w:val="0"/>
+                <w:sz w:val="16"/>
+                <w:rFonts w:eastAsia="맑은 고딕" w:ascii="맑은 고딕" w:hAnsi="맑은 고딕"/>
+              </w:rPr>
+              <w:t>신규</w:t>
+            </w:r>
+          </w:p>
+        </w:tc>
+        <w:tc>
+          <w:tcPr>
+            <w:tcW w:type="dxa" w:w="1871"/>
+            <w:shd w:val="clear" w:color="auto" w:fill="E2EFDA"/>
+          </w:tcPr>
+          <w:p>
+            <w:pPr>
+              <w:spacing w:before="40" w:after="40"/>
+              <w:jc w:val="left"/>
+            </w:pPr>
+            <w:r/>
+            <w:r>
+              <w:rPr>
+                <w:b w:val="0"/>
+                <w:i w:val="0"/>
+                <w:sz w:val="15"/>
+                <w:rFonts w:eastAsia="맑은 고딕" w:ascii="맑은 고딕" w:hAnsi="맑은 고딕"/>
+              </w:rPr>
+              <w:t>갱신 실패로 기동 불능이 되지 않게 함</w:t>
             </w:r>
           </w:p>
         </w:tc>

</xml_diff>